<commit_message>
Add GitHub repository link to lab question 3 write-up
</commit_message>
<xml_diff>
--- a/Topic 8 Lab Question 3.docx
+++ b/Topic 8 Lab Question 3.docx
@@ -92,6 +92,31 @@
       <w:r>
         <w:t xml:space="preserve">Net assessment: shaders simplify the implementation in the sense that matters most for a demo scene — they keep the interesting math (the nonlinear function, the lighting model, the animation) declarative and GPU-parallel instead of hand-rolled in C++ — but they do not reduce the total line count for a project this small; they mostly relocate lines from the .cpp file into two .glsl-ish files that sit outside the 100-line limit.</w:t>
       </w:r>
+    </w:p>
+    <w:p>
+      <w:pPr>
+        <w:pStyle w:val="Heading2"/>
+        <w:spacing w:after="120" w:before="240"/>
+      </w:pPr>
+      <w:r>
+        <w:t xml:space="preserve">GitHub</w:t>
+      </w:r>
+    </w:p>
+    <w:p>
+      <w:pPr>
+        <w:spacing w:after="160"/>
+      </w:pPr>
+      <w:r>
+        <w:t xml:space="preserve">Repository link: </w:t>
+      </w:r>
+      <w:hyperlink w:history="1" r:id="rIdjc0awrhvkdzif0s-mavzt">
+        <w:r>
+          <w:rPr>
+            <w:rStyle w:val="Hyperlink"/>
+          </w:rPr>
+          <w:t xml:space="preserve">https://github.com/ChrisLuciano2/cst310-topic8-lab-question-3</w:t>
+        </w:r>
+      </w:hyperlink>
     </w:p>
     <w:sectPr>
       <w:pgSz w:w="12240" w:h="15840" w:orient="portrait"/>

</xml_diff>

<commit_message>
Update lab question 3 write-up
</commit_message>
<xml_diff>
--- a/Topic 8 Lab Question 3.docx
+++ b/Topic 8 Lab Question 3.docx
@@ -49,7 +49,7 @@
           <w:iCs/>
           <w:color w:val="444444"/>
         </w:rPr>
-        <w:t xml:space="preserve">Carefully read the description of Project 8. Do you think the use of shaders will simplify the implementation?</w:t>
+        <w:t xml:space="preserve">Carefully read the description of Project 8. Do you think the use of shaders will simplify the implementation? Post the explanation and screenshots of your example.</w:t>
       </w:r>
     </w:p>
     <w:p>
@@ -99,6 +99,600 @@
         <w:spacing w:after="120" w:before="240"/>
       </w:pPr>
       <w:r>
+        <w:t xml:space="preserve">Example</w:t>
+      </w:r>
+    </w:p>
+    <w:p>
+      <w:pPr>
+        <w:spacing w:after="160"/>
+      </w:pPr>
+      <w:r>
+        <w:t xml:space="preserve">The sphere mesh from Lab Question 2 is lit entirely in shaders: the vertex shader passes the world-space position and normal through, and the fragment shader runs a full Blinn-Phong lighting model (ambient + diffuse + specular) once per pixel — none of this math touches the C++ side.</w:t>
+      </w:r>
+    </w:p>
+    <w:p>
+      <w:pPr>
+        <w:spacing w:after="160"/>
+      </w:pPr>
+      <w:r>
+        <w:t xml:space="preserve">Vertex shader (sphere_mesh_shaders/sph.vert):</w:t>
+      </w:r>
+    </w:p>
+    <w:p>
+      <w:pPr>
+        <w:shd w:fill="F2F2F2" w:val="clear"/>
+        <w:spacing w:after="0"/>
+      </w:pPr>
+      <w:r>
+        <w:rPr>
+          <w:rFonts w:ascii="Consolas" w:cs="Consolas" w:eastAsia="Consolas" w:hAnsi="Consolas"/>
+          <w:sz w:val="18"/>
+          <w:szCs w:val="18"/>
+        </w:rPr>
+        <w:t xml:space="preserve">#version 410 core</w:t>
+      </w:r>
+    </w:p>
+    <w:p>
+      <w:pPr>
+        <w:shd w:fill="F2F2F2" w:val="clear"/>
+        <w:spacing w:after="0"/>
+      </w:pPr>
+      <w:r>
+        <w:rPr>
+          <w:rFonts w:ascii="Consolas" w:cs="Consolas" w:eastAsia="Consolas" w:hAnsi="Consolas"/>
+          <w:sz w:val="18"/>
+          <w:szCs w:val="18"/>
+        </w:rPr>
+        <w:t xml:space="preserve">layout(location = 0) in vec3 aPos;</w:t>
+      </w:r>
+    </w:p>
+    <w:p>
+      <w:pPr>
+        <w:shd w:fill="F2F2F2" w:val="clear"/>
+        <w:spacing w:after="0"/>
+      </w:pPr>
+      <w:r>
+        <w:rPr>
+          <w:rFonts w:ascii="Consolas" w:cs="Consolas" w:eastAsia="Consolas" w:hAnsi="Consolas"/>
+          <w:sz w:val="18"/>
+          <w:szCs w:val="18"/>
+        </w:rPr>
+        <w:t xml:space="preserve">layout(location = 1) in vec3 aNormal;</w:t>
+      </w:r>
+    </w:p>
+    <w:p>
+      <w:pPr>
+        <w:shd w:fill="F2F2F2" w:val="clear"/>
+        <w:spacing w:after="0"/>
+      </w:pPr>
+      <w:r>
+        <w:rPr>
+          <w:rFonts w:ascii="Consolas" w:cs="Consolas" w:eastAsia="Consolas" w:hAnsi="Consolas"/>
+          <w:sz w:val="18"/>
+          <w:szCs w:val="18"/>
+        </w:rPr>
+        <w:t xml:space="preserve">uniform mat4 uModel;</w:t>
+      </w:r>
+    </w:p>
+    <w:p>
+      <w:pPr>
+        <w:shd w:fill="F2F2F2" w:val="clear"/>
+        <w:spacing w:after="0"/>
+      </w:pPr>
+      <w:r>
+        <w:rPr>
+          <w:rFonts w:ascii="Consolas" w:cs="Consolas" w:eastAsia="Consolas" w:hAnsi="Consolas"/>
+          <w:sz w:val="18"/>
+          <w:szCs w:val="18"/>
+        </w:rPr>
+        <w:t xml:space="preserve">uniform mat4 uView;</w:t>
+      </w:r>
+    </w:p>
+    <w:p>
+      <w:pPr>
+        <w:shd w:fill="F2F2F2" w:val="clear"/>
+        <w:spacing w:after="0"/>
+      </w:pPr>
+      <w:r>
+        <w:rPr>
+          <w:rFonts w:ascii="Consolas" w:cs="Consolas" w:eastAsia="Consolas" w:hAnsi="Consolas"/>
+          <w:sz w:val="18"/>
+          <w:szCs w:val="18"/>
+        </w:rPr>
+        <w:t xml:space="preserve">uniform mat4 uProjection;</w:t>
+      </w:r>
+    </w:p>
+    <w:p>
+      <w:pPr>
+        <w:shd w:fill="F2F2F2" w:val="clear"/>
+        <w:spacing w:after="0"/>
+      </w:pPr>
+      <w:r>
+        <w:rPr>
+          <w:rFonts w:ascii="Consolas" w:cs="Consolas" w:eastAsia="Consolas" w:hAnsi="Consolas"/>
+          <w:sz w:val="18"/>
+          <w:szCs w:val="18"/>
+        </w:rPr>
+        <w:t xml:space="preserve">uniform mat3 uNormalMatrix;</w:t>
+      </w:r>
+    </w:p>
+    <w:p>
+      <w:pPr>
+        <w:shd w:fill="F2F2F2" w:val="clear"/>
+        <w:spacing w:after="0"/>
+      </w:pPr>
+      <w:r>
+        <w:rPr>
+          <w:rFonts w:ascii="Consolas" w:cs="Consolas" w:eastAsia="Consolas" w:hAnsi="Consolas"/>
+          <w:sz w:val="18"/>
+          <w:szCs w:val="18"/>
+        </w:rPr>
+        <w:t xml:space="preserve">out vec3 vNormal;</w:t>
+      </w:r>
+    </w:p>
+    <w:p>
+      <w:pPr>
+        <w:shd w:fill="F2F2F2" w:val="clear"/>
+        <w:spacing w:after="0"/>
+      </w:pPr>
+      <w:r>
+        <w:rPr>
+          <w:rFonts w:ascii="Consolas" w:cs="Consolas" w:eastAsia="Consolas" w:hAnsi="Consolas"/>
+          <w:sz w:val="18"/>
+          <w:szCs w:val="18"/>
+        </w:rPr>
+        <w:t xml:space="preserve">out vec3 vWorldPos;</w:t>
+      </w:r>
+    </w:p>
+    <w:p>
+      <w:pPr>
+        <w:shd w:fill="F2F2F2" w:val="clear"/>
+        <w:spacing w:after="0"/>
+      </w:pPr>
+      <w:r>
+        <w:rPr>
+          <w:rFonts w:ascii="Consolas" w:cs="Consolas" w:eastAsia="Consolas" w:hAnsi="Consolas"/>
+          <w:sz w:val="18"/>
+          <w:szCs w:val="18"/>
+        </w:rPr>
+        <w:t xml:space="preserve">void main() {</w:t>
+      </w:r>
+    </w:p>
+    <w:p>
+      <w:pPr>
+        <w:shd w:fill="F2F2F2" w:val="clear"/>
+        <w:spacing w:after="0"/>
+      </w:pPr>
+      <w:r>
+        <w:rPr>
+          <w:rFonts w:ascii="Consolas" w:cs="Consolas" w:eastAsia="Consolas" w:hAnsi="Consolas"/>
+          <w:sz w:val="18"/>
+          <w:szCs w:val="18"/>
+        </w:rPr>
+        <w:t xml:space="preserve">    vec4 wp = uModel * vec4(aPos, 1.0);</w:t>
+      </w:r>
+    </w:p>
+    <w:p>
+      <w:pPr>
+        <w:shd w:fill="F2F2F2" w:val="clear"/>
+        <w:spacing w:after="0"/>
+      </w:pPr>
+      <w:r>
+        <w:rPr>
+          <w:rFonts w:ascii="Consolas" w:cs="Consolas" w:eastAsia="Consolas" w:hAnsi="Consolas"/>
+          <w:sz w:val="18"/>
+          <w:szCs w:val="18"/>
+        </w:rPr>
+        <w:t xml:space="preserve">    vWorldPos = wp.xyz;</w:t>
+      </w:r>
+    </w:p>
+    <w:p>
+      <w:pPr>
+        <w:shd w:fill="F2F2F2" w:val="clear"/>
+        <w:spacing w:after="0"/>
+      </w:pPr>
+      <w:r>
+        <w:rPr>
+          <w:rFonts w:ascii="Consolas" w:cs="Consolas" w:eastAsia="Consolas" w:hAnsi="Consolas"/>
+          <w:sz w:val="18"/>
+          <w:szCs w:val="18"/>
+        </w:rPr>
+        <w:t xml:space="preserve">    vNormal = normalize(uNormalMatrix * aNormal);</w:t>
+      </w:r>
+    </w:p>
+    <w:p>
+      <w:pPr>
+        <w:shd w:fill="F2F2F2" w:val="clear"/>
+        <w:spacing w:after="0"/>
+      </w:pPr>
+      <w:r>
+        <w:rPr>
+          <w:rFonts w:ascii="Consolas" w:cs="Consolas" w:eastAsia="Consolas" w:hAnsi="Consolas"/>
+          <w:sz w:val="18"/>
+          <w:szCs w:val="18"/>
+        </w:rPr>
+        <w:t xml:space="preserve">    gl_Position = uProjection * uView * wp;</w:t>
+      </w:r>
+    </w:p>
+    <w:p>
+      <w:pPr>
+        <w:shd w:fill="F2F2F2" w:val="clear"/>
+        <w:spacing w:after="0"/>
+      </w:pPr>
+      <w:r>
+        <w:rPr>
+          <w:rFonts w:ascii="Consolas" w:cs="Consolas" w:eastAsia="Consolas" w:hAnsi="Consolas"/>
+          <w:sz w:val="18"/>
+          <w:szCs w:val="18"/>
+        </w:rPr>
+        <w:t xml:space="preserve">}</w:t>
+      </w:r>
+    </w:p>
+    <w:p>
+      <w:pPr>
+        <w:spacing w:after="160"/>
+      </w:pPr>
+      <w:r>
+        <w:t xml:space="preserve">Fragment shader (sphere_mesh_shaders/sph.frag) — the actual lighting math:</w:t>
+      </w:r>
+    </w:p>
+    <w:p>
+      <w:pPr>
+        <w:shd w:fill="F2F2F2" w:val="clear"/>
+        <w:spacing w:after="0"/>
+      </w:pPr>
+      <w:r>
+        <w:rPr>
+          <w:rFonts w:ascii="Consolas" w:cs="Consolas" w:eastAsia="Consolas" w:hAnsi="Consolas"/>
+          <w:sz w:val="18"/>
+          <w:szCs w:val="18"/>
+        </w:rPr>
+        <w:t xml:space="preserve">#version 410 core</w:t>
+      </w:r>
+    </w:p>
+    <w:p>
+      <w:pPr>
+        <w:shd w:fill="F2F2F2" w:val="clear"/>
+        <w:spacing w:after="0"/>
+      </w:pPr>
+      <w:r>
+        <w:rPr>
+          <w:rFonts w:ascii="Consolas" w:cs="Consolas" w:eastAsia="Consolas" w:hAnsi="Consolas"/>
+          <w:sz w:val="18"/>
+          <w:szCs w:val="18"/>
+        </w:rPr>
+        <w:t xml:space="preserve">in vec3 vNormal;</w:t>
+      </w:r>
+    </w:p>
+    <w:p>
+      <w:pPr>
+        <w:shd w:fill="F2F2F2" w:val="clear"/>
+        <w:spacing w:after="0"/>
+      </w:pPr>
+      <w:r>
+        <w:rPr>
+          <w:rFonts w:ascii="Consolas" w:cs="Consolas" w:eastAsia="Consolas" w:hAnsi="Consolas"/>
+          <w:sz w:val="18"/>
+          <w:szCs w:val="18"/>
+        </w:rPr>
+        <w:t xml:space="preserve">in vec3 vWorldPos;</w:t>
+      </w:r>
+    </w:p>
+    <w:p>
+      <w:pPr>
+        <w:shd w:fill="F2F2F2" w:val="clear"/>
+        <w:spacing w:after="0"/>
+      </w:pPr>
+      <w:r>
+        <w:rPr>
+          <w:rFonts w:ascii="Consolas" w:cs="Consolas" w:eastAsia="Consolas" w:hAnsi="Consolas"/>
+          <w:sz w:val="18"/>
+          <w:szCs w:val="18"/>
+        </w:rPr>
+        <w:t xml:space="preserve">out vec4 FragColor;</w:t>
+      </w:r>
+    </w:p>
+    <w:p>
+      <w:pPr>
+        <w:shd w:fill="F2F2F2" w:val="clear"/>
+        <w:spacing w:after="0"/>
+      </w:pPr>
+      <w:r>
+        <w:rPr>
+          <w:rFonts w:ascii="Consolas" w:cs="Consolas" w:eastAsia="Consolas" w:hAnsi="Consolas"/>
+          <w:sz w:val="18"/>
+          <w:szCs w:val="18"/>
+        </w:rPr>
+        <w:t xml:space="preserve">uniform vec3 uLightDir;</w:t>
+      </w:r>
+    </w:p>
+    <w:p>
+      <w:pPr>
+        <w:shd w:fill="F2F2F2" w:val="clear"/>
+        <w:spacing w:after="0"/>
+      </w:pPr>
+      <w:r>
+        <w:rPr>
+          <w:rFonts w:ascii="Consolas" w:cs="Consolas" w:eastAsia="Consolas" w:hAnsi="Consolas"/>
+          <w:sz w:val="18"/>
+          <w:szCs w:val="18"/>
+        </w:rPr>
+        <w:t xml:space="preserve">uniform vec3 uCamPos;</w:t>
+      </w:r>
+    </w:p>
+    <w:p>
+      <w:pPr>
+        <w:shd w:fill="F2F2F2" w:val="clear"/>
+        <w:spacing w:after="0"/>
+      </w:pPr>
+      <w:r>
+        <w:rPr>
+          <w:rFonts w:ascii="Consolas" w:cs="Consolas" w:eastAsia="Consolas" w:hAnsi="Consolas"/>
+          <w:sz w:val="18"/>
+          <w:szCs w:val="18"/>
+        </w:rPr>
+        <w:t xml:space="preserve">void main() {</w:t>
+      </w:r>
+    </w:p>
+    <w:p>
+      <w:pPr>
+        <w:shd w:fill="F2F2F2" w:val="clear"/>
+        <w:spacing w:after="0"/>
+      </w:pPr>
+      <w:r>
+        <w:rPr>
+          <w:rFonts w:ascii="Consolas" w:cs="Consolas" w:eastAsia="Consolas" w:hAnsi="Consolas"/>
+          <w:sz w:val="18"/>
+          <w:szCs w:val="18"/>
+        </w:rPr>
+        <w:t xml:space="preserve">    vec3 N = normalize(vNormal);</w:t>
+      </w:r>
+    </w:p>
+    <w:p>
+      <w:pPr>
+        <w:shd w:fill="F2F2F2" w:val="clear"/>
+        <w:spacing w:after="0"/>
+      </w:pPr>
+      <w:r>
+        <w:rPr>
+          <w:rFonts w:ascii="Consolas" w:cs="Consolas" w:eastAsia="Consolas" w:hAnsi="Consolas"/>
+          <w:sz w:val="18"/>
+          <w:szCs w:val="18"/>
+        </w:rPr>
+        <w:t xml:space="preserve">    vec3 L = normalize(uLightDir);</w:t>
+      </w:r>
+    </w:p>
+    <w:p>
+      <w:pPr>
+        <w:shd w:fill="F2F2F2" w:val="clear"/>
+        <w:spacing w:after="0"/>
+      </w:pPr>
+      <w:r>
+        <w:rPr>
+          <w:rFonts w:ascii="Consolas" w:cs="Consolas" w:eastAsia="Consolas" w:hAnsi="Consolas"/>
+          <w:sz w:val="18"/>
+          <w:szCs w:val="18"/>
+        </w:rPr>
+        <w:t xml:space="preserve">    vec3 V = normalize(uCamPos - vWorldPos);</w:t>
+      </w:r>
+    </w:p>
+    <w:p>
+      <w:pPr>
+        <w:shd w:fill="F2F2F2" w:val="clear"/>
+        <w:spacing w:after="0"/>
+      </w:pPr>
+      <w:r>
+        <w:rPr>
+          <w:rFonts w:ascii="Consolas" w:cs="Consolas" w:eastAsia="Consolas" w:hAnsi="Consolas"/>
+          <w:sz w:val="18"/>
+          <w:szCs w:val="18"/>
+        </w:rPr>
+        <w:t xml:space="preserve">    vec3 H = normalize(L + V);</w:t>
+      </w:r>
+    </w:p>
+    <w:p>
+      <w:pPr>
+        <w:shd w:fill="F2F2F2" w:val="clear"/>
+        <w:spacing w:after="0"/>
+      </w:pPr>
+      <w:r>
+        <w:rPr>
+          <w:rFonts w:ascii="Consolas" w:cs="Consolas" w:eastAsia="Consolas" w:hAnsi="Consolas"/>
+          <w:sz w:val="18"/>
+          <w:szCs w:val="18"/>
+        </w:rPr>
+        <w:t xml:space="preserve">    float NdotL = max(dot(N, L), 0.0);</w:t>
+      </w:r>
+    </w:p>
+    <w:p>
+      <w:pPr>
+        <w:shd w:fill="F2F2F2" w:val="clear"/>
+        <w:spacing w:after="0"/>
+      </w:pPr>
+      <w:r>
+        <w:rPr>
+          <w:rFonts w:ascii="Consolas" w:cs="Consolas" w:eastAsia="Consolas" w:hAnsi="Consolas"/>
+          <w:sz w:val="18"/>
+          <w:szCs w:val="18"/>
+        </w:rPr>
+        <w:t xml:space="preserve">    float NdotH = max(dot(N, H), 0.0);</w:t>
+      </w:r>
+    </w:p>
+    <w:p>
+      <w:pPr>
+        <w:shd w:fill="F2F2F2" w:val="clear"/>
+        <w:spacing w:after="0"/>
+      </w:pPr>
+      <w:r>
+        <w:rPr>
+          <w:rFonts w:ascii="Consolas" w:cs="Consolas" w:eastAsia="Consolas" w:hAnsi="Consolas"/>
+          <w:sz w:val="18"/>
+          <w:szCs w:val="18"/>
+        </w:rPr>
+        <w:t xml:space="preserve">    float spec = pow(NdotH, 64.0) * (NdotL &gt; 0.0 ? 1.0 : 0.0);</w:t>
+      </w:r>
+    </w:p>
+    <w:p>
+      <w:pPr>
+        <w:shd w:fill="F2F2F2" w:val="clear"/>
+        <w:spacing w:after="0"/>
+      </w:pPr>
+      <w:r>
+        <w:rPr>
+          <w:rFonts w:ascii="Consolas" w:cs="Consolas" w:eastAsia="Consolas" w:hAnsi="Consolas"/>
+          <w:sz w:val="18"/>
+          <w:szCs w:val="18"/>
+        </w:rPr>
+        <w:t xml:space="preserve">    vec3 lightColor = vec3(1.0, 0.95, 0.85);</w:t>
+      </w:r>
+    </w:p>
+    <w:p>
+      <w:pPr>
+        <w:shd w:fill="F2F2F2" w:val="clear"/>
+        <w:spacing w:after="0"/>
+      </w:pPr>
+      <w:r>
+        <w:rPr>
+          <w:rFonts w:ascii="Consolas" w:cs="Consolas" w:eastAsia="Consolas" w:hAnsi="Consolas"/>
+          <w:sz w:val="18"/>
+          <w:szCs w:val="18"/>
+        </w:rPr>
+        <w:t xml:space="preserve">    vec3 objColor   = vec3(0.40, 0.78, 0.74);   // teal</w:t>
+      </w:r>
+    </w:p>
+    <w:p>
+      <w:pPr>
+        <w:shd w:fill="F2F2F2" w:val="clear"/>
+        <w:spacing w:after="0"/>
+      </w:pPr>
+      <w:r>
+        <w:rPr>
+          <w:rFonts w:ascii="Consolas" w:cs="Consolas" w:eastAsia="Consolas" w:hAnsi="Consolas"/>
+          <w:sz w:val="18"/>
+          <w:szCs w:val="18"/>
+        </w:rPr>
+        <w:t xml:space="preserve">    vec3 ambient    = 0.12 * lightColor;</w:t>
+      </w:r>
+    </w:p>
+    <w:p>
+      <w:pPr>
+        <w:shd w:fill="F2F2F2" w:val="clear"/>
+        <w:spacing w:after="0"/>
+      </w:pPr>
+      <w:r>
+        <w:rPr>
+          <w:rFonts w:ascii="Consolas" w:cs="Consolas" w:eastAsia="Consolas" w:hAnsi="Consolas"/>
+          <w:sz w:val="18"/>
+          <w:szCs w:val="18"/>
+        </w:rPr>
+        <w:t xml:space="preserve">    vec3 color = objColor * (ambient + NdotL * lightColor) + spec * lightColor;</w:t>
+      </w:r>
+    </w:p>
+    <w:p>
+      <w:pPr>
+        <w:shd w:fill="F2F2F2" w:val="clear"/>
+        <w:spacing w:after="0"/>
+      </w:pPr>
+      <w:r>
+        <w:rPr>
+          <w:rFonts w:ascii="Consolas" w:cs="Consolas" w:eastAsia="Consolas" w:hAnsi="Consolas"/>
+          <w:sz w:val="18"/>
+          <w:szCs w:val="18"/>
+        </w:rPr>
+        <w:t xml:space="preserve">    FragColor = vec4(color, 1.0);</w:t>
+      </w:r>
+    </w:p>
+    <w:p>
+      <w:pPr>
+        <w:shd w:fill="F2F2F2" w:val="clear"/>
+        <w:spacing w:after="0"/>
+      </w:pPr>
+      <w:r>
+        <w:rPr>
+          <w:rFonts w:ascii="Consolas" w:cs="Consolas" w:eastAsia="Consolas" w:hAnsi="Consolas"/>
+          <w:sz w:val="18"/>
+          <w:szCs w:val="18"/>
+        </w:rPr>
+        <w:t xml:space="preserve">}</w:t>
+      </w:r>
+    </w:p>
+    <w:p>
+      <w:pPr>
+        <w:pStyle w:val="Heading2"/>
+        <w:spacing w:after="120" w:before="240"/>
+      </w:pPr>
+      <w:r>
+        <w:t xml:space="preserve">Screenshot of the example running</w:t>
+      </w:r>
+    </w:p>
+    <w:p>
+      <w:pPr>
+        <w:spacing w:after="60" w:before="120"/>
+        <w:jc w:val="center"/>
+      </w:pPr>
+      <w:r>
+        <w:drawing>
+          <wp:inline distT="0" distB="0" distL="0" distR="0">
+            <wp:extent cx="4191000" cy="3535558"/>
+            <wp:effectExtent t="0" r="0" b="0" l="0"/>
+            <wp:docPr id="1" name="" descr="" title=""/>
+            <wp:cNvGraphicFramePr>
+              <a:graphicFrameLocks xmlns:a="http://schemas.openxmlformats.org/drawingml/2006/main" noChangeAspect="1"/>
+            </wp:cNvGraphicFramePr>
+            <a:graphic xmlns:a="http://schemas.openxmlformats.org/drawingml/2006/main">
+              <a:graphicData uri="http://schemas.openxmlformats.org/drawingml/2006/picture">
+                <pic:pic xmlns:pic="http://schemas.openxmlformats.org/drawingml/2006/picture">
+                  <pic:nvPicPr>
+                    <pic:cNvPr id="0" name="" descr=""/>
+                    <pic:cNvPicPr>
+                      <a:picLocks noChangeAspect="1" noChangeArrowheads="1"/>
+                    </pic:cNvPicPr>
+                  </pic:nvPicPr>
+                  <pic:blipFill>
+                    <a:blip r:embed="rId7" cstate="none"/>
+                    <a:srcRect/>
+                    <a:stretch>
+                      <a:fillRect/>
+                    </a:stretch>
+                  </pic:blipFill>
+                  <pic:spPr bwMode="auto">
+                    <a:xfrm>
+                      <a:off x="0" y="0"/>
+                      <a:ext cx="4191000" cy="3535558"/>
+                    </a:xfrm>
+                    <a:prstGeom prst="rect">
+                      <a:avLst/>
+                    </a:prstGeom>
+                  </pic:spPr>
+                </pic:pic>
+              </a:graphicData>
+            </a:graphic>
+          </wp:inline>
+        </w:drawing>
+      </w:r>
+    </w:p>
+    <w:p>
+      <w:pPr>
+        <w:spacing w:after="300"/>
+        <w:jc w:val="center"/>
+      </w:pPr>
+      <w:r>
+        <w:rPr>
+          <w:i/>
+          <w:iCs/>
+          <w:color w:val="555555"/>
+          <w:sz w:val="18"/>
+          <w:szCs w:val="18"/>
+        </w:rPr>
+        <w:t xml:space="preserve">The sphere from Lab Question 2, shaded entirely by the vertex/fragment shaders above — the ambient + diffuse + specular blend and the moving highlight are both computed per-pixel on the GPU, not in C++.</w:t>
+      </w:r>
+    </w:p>
+    <w:p>
+      <w:pPr>
+        <w:pStyle w:val="Heading2"/>
+        <w:spacing w:after="120" w:before="240"/>
+      </w:pPr>
+      <w:r>
         <w:t xml:space="preserve">GitHub</w:t>
       </w:r>
     </w:p>
@@ -109,7 +703,7 @@
       <w:r>
         <w:t xml:space="preserve">Repository link: </w:t>
       </w:r>
-      <w:hyperlink w:history="1" r:id="rIdjc0awrhvkdzif0s-mavzt">
+      <w:hyperlink w:history="1" r:id="rIds_llhv0uxhiomjd08ty4s">
         <w:r>
           <w:rPr>
             <w:rStyle w:val="Hyperlink"/>

</xml_diff>